<commit_message>
cambio en el docx
</commit_message>
<xml_diff>
--- a/evaluacion practica.docx
+++ b/evaluacion practica.docx
@@ -3514,6 +3514,474 @@
                     <a:xfrm>
                       <a:off x="0" y="0"/>
                       <a:ext cx="5612130" cy="2329180"/>
+                    </a:xfrm>
+                    <a:prstGeom prst="rect">
+                      <a:avLst/>
+                    </a:prstGeom>
+                  </pic:spPr>
+                </pic:pic>
+              </a:graphicData>
+            </a:graphic>
+          </wp:inline>
+        </w:drawing>
+      </w:r>
+    </w:p>
+    <w:p>
+      <w:pPr>
+        <w:spacing w:line="240" w:lineRule="auto"/>
+        <w:jc w:val="both"/>
+        <w:rPr>
+          <w:rFonts w:ascii="Times New Roman" w:hAnsi="Times New Roman" w:cs="Times New Roman"/>
+          <w:b/>
+        </w:rPr>
+      </w:pPr>
+    </w:p>
+    <w:p>
+      <w:pPr>
+        <w:spacing w:line="240" w:lineRule="auto"/>
+        <w:jc w:val="both"/>
+        <w:rPr>
+          <w:rFonts w:ascii="Times New Roman" w:hAnsi="Times New Roman" w:cs="Times New Roman"/>
+          <w:b/>
+        </w:rPr>
+      </w:pPr>
+    </w:p>
+    <w:p>
+      <w:pPr>
+        <w:spacing w:line="240" w:lineRule="auto"/>
+        <w:jc w:val="both"/>
+        <w:rPr>
+          <w:rFonts w:ascii="Times New Roman" w:hAnsi="Times New Roman" w:cs="Times New Roman"/>
+          <w:b/>
+        </w:rPr>
+      </w:pPr>
+      <w:r>
+        <w:rPr>
+          <w:rFonts w:ascii="Times New Roman" w:hAnsi="Times New Roman" w:cs="Times New Roman"/>
+          <w:b/>
+        </w:rPr>
+        <w:drawing>
+          <wp:inline distT="0" distB="0" distL="0" distR="0" wp14:anchorId="3042AD7F" wp14:editId="0906AE2B">
+            <wp:extent cx="5553850" cy="2229161"/>
+            <wp:effectExtent l="0" t="0" r="8890" b="0"/>
+            <wp:docPr id="2" name="Imagen 2"/>
+            <wp:cNvGraphicFramePr>
+              <a:graphicFrameLocks xmlns:a="http://schemas.openxmlformats.org/drawingml/2006/main" noChangeAspect="1"/>
+            </wp:cNvGraphicFramePr>
+            <a:graphic xmlns:a="http://schemas.openxmlformats.org/drawingml/2006/main">
+              <a:graphicData uri="http://schemas.openxmlformats.org/drawingml/2006/picture">
+                <pic:pic xmlns:pic="http://schemas.openxmlformats.org/drawingml/2006/picture">
+                  <pic:nvPicPr>
+                    <pic:cNvPr id="1" name=""/>
+                    <pic:cNvPicPr/>
+                  </pic:nvPicPr>
+                  <pic:blipFill>
+                    <a:blip r:embed="rId6"/>
+                    <a:stretch>
+                      <a:fillRect/>
+                    </a:stretch>
+                  </pic:blipFill>
+                  <pic:spPr>
+                    <a:xfrm>
+                      <a:off x="0" y="0"/>
+                      <a:ext cx="5553850" cy="2229161"/>
+                    </a:xfrm>
+                    <a:prstGeom prst="rect">
+                      <a:avLst/>
+                    </a:prstGeom>
+                  </pic:spPr>
+                </pic:pic>
+              </a:graphicData>
+            </a:graphic>
+          </wp:inline>
+        </w:drawing>
+      </w:r>
+    </w:p>
+    <w:p>
+      <w:pPr>
+        <w:spacing w:line="240" w:lineRule="auto"/>
+        <w:jc w:val="both"/>
+        <w:rPr>
+          <w:rFonts w:ascii="Times New Roman" w:hAnsi="Times New Roman" w:cs="Times New Roman"/>
+          <w:b/>
+        </w:rPr>
+      </w:pPr>
+    </w:p>
+    <w:p>
+      <w:pPr>
+        <w:spacing w:line="240" w:lineRule="auto"/>
+        <w:jc w:val="both"/>
+        <w:rPr>
+          <w:rFonts w:ascii="Times New Roman" w:hAnsi="Times New Roman" w:cs="Times New Roman"/>
+          <w:b/>
+        </w:rPr>
+      </w:pPr>
+      <w:r>
+        <w:rPr>
+          <w:rFonts w:ascii="Times New Roman" w:hAnsi="Times New Roman" w:cs="Times New Roman"/>
+          <w:b/>
+        </w:rPr>
+        <w:lastRenderedPageBreak/>
+        <w:drawing>
+          <wp:inline distT="0" distB="0" distL="0" distR="0" wp14:anchorId="25794AD0" wp14:editId="55E5C323">
+            <wp:extent cx="5612130" cy="2773680"/>
+            <wp:effectExtent l="0" t="0" r="7620" b="7620"/>
+            <wp:docPr id="3" name="Imagen 3"/>
+            <wp:cNvGraphicFramePr>
+              <a:graphicFrameLocks xmlns:a="http://schemas.openxmlformats.org/drawingml/2006/main" noChangeAspect="1"/>
+            </wp:cNvGraphicFramePr>
+            <a:graphic xmlns:a="http://schemas.openxmlformats.org/drawingml/2006/main">
+              <a:graphicData uri="http://schemas.openxmlformats.org/drawingml/2006/picture">
+                <pic:pic xmlns:pic="http://schemas.openxmlformats.org/drawingml/2006/picture">
+                  <pic:nvPicPr>
+                    <pic:cNvPr id="1" name=""/>
+                    <pic:cNvPicPr/>
+                  </pic:nvPicPr>
+                  <pic:blipFill>
+                    <a:blip r:embed="rId7"/>
+                    <a:stretch>
+                      <a:fillRect/>
+                    </a:stretch>
+                  </pic:blipFill>
+                  <pic:spPr>
+                    <a:xfrm>
+                      <a:off x="0" y="0"/>
+                      <a:ext cx="5612130" cy="2773680"/>
+                    </a:xfrm>
+                    <a:prstGeom prst="rect">
+                      <a:avLst/>
+                    </a:prstGeom>
+                  </pic:spPr>
+                </pic:pic>
+              </a:graphicData>
+            </a:graphic>
+          </wp:inline>
+        </w:drawing>
+      </w:r>
+    </w:p>
+    <w:p>
+      <w:pPr>
+        <w:spacing w:line="240" w:lineRule="auto"/>
+        <w:jc w:val="both"/>
+        <w:rPr>
+          <w:rFonts w:ascii="Times New Roman" w:hAnsi="Times New Roman" w:cs="Times New Roman"/>
+          <w:b/>
+        </w:rPr>
+      </w:pPr>
+    </w:p>
+    <w:p>
+      <w:pPr>
+        <w:spacing w:line="240" w:lineRule="auto"/>
+        <w:jc w:val="both"/>
+        <w:rPr>
+          <w:rFonts w:ascii="Times New Roman" w:hAnsi="Times New Roman" w:cs="Times New Roman"/>
+          <w:b/>
+        </w:rPr>
+      </w:pPr>
+      <w:r>
+        <w:rPr>
+          <w:rFonts w:ascii="Times New Roman" w:hAnsi="Times New Roman" w:cs="Times New Roman"/>
+          <w:b/>
+        </w:rPr>
+        <w:drawing>
+          <wp:inline distT="0" distB="0" distL="0" distR="0" wp14:anchorId="237E021C" wp14:editId="3423C483">
+            <wp:extent cx="4972744" cy="2848373"/>
+            <wp:effectExtent l="0" t="0" r="0" b="9525"/>
+            <wp:docPr id="4" name="Imagen 4"/>
+            <wp:cNvGraphicFramePr>
+              <a:graphicFrameLocks xmlns:a="http://schemas.openxmlformats.org/drawingml/2006/main" noChangeAspect="1"/>
+            </wp:cNvGraphicFramePr>
+            <a:graphic xmlns:a="http://schemas.openxmlformats.org/drawingml/2006/main">
+              <a:graphicData uri="http://schemas.openxmlformats.org/drawingml/2006/picture">
+                <pic:pic xmlns:pic="http://schemas.openxmlformats.org/drawingml/2006/picture">
+                  <pic:nvPicPr>
+                    <pic:cNvPr id="1" name=""/>
+                    <pic:cNvPicPr/>
+                  </pic:nvPicPr>
+                  <pic:blipFill>
+                    <a:blip r:embed="rId8"/>
+                    <a:stretch>
+                      <a:fillRect/>
+                    </a:stretch>
+                  </pic:blipFill>
+                  <pic:spPr>
+                    <a:xfrm>
+                      <a:off x="0" y="0"/>
+                      <a:ext cx="4972744" cy="2848373"/>
+                    </a:xfrm>
+                    <a:prstGeom prst="rect">
+                      <a:avLst/>
+                    </a:prstGeom>
+                  </pic:spPr>
+                </pic:pic>
+              </a:graphicData>
+            </a:graphic>
+          </wp:inline>
+        </w:drawing>
+      </w:r>
+    </w:p>
+    <w:p>
+      <w:pPr>
+        <w:spacing w:line="240" w:lineRule="auto"/>
+        <w:jc w:val="both"/>
+        <w:rPr>
+          <w:rFonts w:ascii="Times New Roman" w:hAnsi="Times New Roman" w:cs="Times New Roman"/>
+          <w:b/>
+        </w:rPr>
+      </w:pPr>
+    </w:p>
+    <w:p>
+      <w:pPr>
+        <w:spacing w:line="240" w:lineRule="auto"/>
+        <w:jc w:val="both"/>
+        <w:rPr>
+          <w:rFonts w:ascii="Times New Roman" w:hAnsi="Times New Roman" w:cs="Times New Roman"/>
+          <w:b/>
+        </w:rPr>
+      </w:pPr>
+      <w:proofErr w:type="spellStart"/>
+      <w:r>
+        <w:rPr>
+          <w:rFonts w:ascii="Times New Roman" w:hAnsi="Times New Roman" w:cs="Times New Roman"/>
+          <w:b/>
+        </w:rPr>
+        <w:t>Commit</w:t>
+      </w:r>
+      <w:proofErr w:type="spellEnd"/>
+      <w:r>
+        <w:rPr>
+          <w:rFonts w:ascii="Times New Roman" w:hAnsi="Times New Roman" w:cs="Times New Roman"/>
+          <w:b/>
+        </w:rPr>
+        <w:t xml:space="preserve"> 1</w:t>
+      </w:r>
+    </w:p>
+    <w:p>
+      <w:pPr>
+        <w:spacing w:line="240" w:lineRule="auto"/>
+        <w:jc w:val="both"/>
+        <w:rPr>
+          <w:rFonts w:ascii="Times New Roman" w:hAnsi="Times New Roman" w:cs="Times New Roman"/>
+          <w:b/>
+        </w:rPr>
+      </w:pPr>
+      <w:r>
+        <w:rPr>
+          <w:rFonts w:ascii="Times New Roman" w:hAnsi="Times New Roman" w:cs="Times New Roman"/>
+          <w:b/>
+        </w:rPr>
+        <w:lastRenderedPageBreak/>
+        <w:drawing>
+          <wp:inline distT="0" distB="0" distL="0" distR="0" wp14:anchorId="7C8EC126" wp14:editId="3630A4F4">
+            <wp:extent cx="5612130" cy="4645660"/>
+            <wp:effectExtent l="0" t="0" r="7620" b="2540"/>
+            <wp:docPr id="5" name="Imagen 5"/>
+            <wp:cNvGraphicFramePr>
+              <a:graphicFrameLocks xmlns:a="http://schemas.openxmlformats.org/drawingml/2006/main" noChangeAspect="1"/>
+            </wp:cNvGraphicFramePr>
+            <a:graphic xmlns:a="http://schemas.openxmlformats.org/drawingml/2006/main">
+              <a:graphicData uri="http://schemas.openxmlformats.org/drawingml/2006/picture">
+                <pic:pic xmlns:pic="http://schemas.openxmlformats.org/drawingml/2006/picture">
+                  <pic:nvPicPr>
+                    <pic:cNvPr id="1" name=""/>
+                    <pic:cNvPicPr/>
+                  </pic:nvPicPr>
+                  <pic:blipFill>
+                    <a:blip r:embed="rId9"/>
+                    <a:stretch>
+                      <a:fillRect/>
+                    </a:stretch>
+                  </pic:blipFill>
+                  <pic:spPr>
+                    <a:xfrm>
+                      <a:off x="0" y="0"/>
+                      <a:ext cx="5612130" cy="4645660"/>
+                    </a:xfrm>
+                    <a:prstGeom prst="rect">
+                      <a:avLst/>
+                    </a:prstGeom>
+                  </pic:spPr>
+                </pic:pic>
+              </a:graphicData>
+            </a:graphic>
+          </wp:inline>
+        </w:drawing>
+      </w:r>
+    </w:p>
+    <w:p>
+      <w:pPr>
+        <w:spacing w:line="240" w:lineRule="auto"/>
+        <w:jc w:val="both"/>
+        <w:rPr>
+          <w:rFonts w:ascii="Times New Roman" w:hAnsi="Times New Roman" w:cs="Times New Roman"/>
+          <w:b/>
+        </w:rPr>
+      </w:pPr>
+    </w:p>
+    <w:p>
+      <w:pPr>
+        <w:spacing w:line="240" w:lineRule="auto"/>
+        <w:jc w:val="both"/>
+        <w:rPr>
+          <w:rFonts w:ascii="Times New Roman" w:hAnsi="Times New Roman" w:cs="Times New Roman"/>
+          <w:b/>
+        </w:rPr>
+      </w:pPr>
+    </w:p>
+    <w:p>
+      <w:pPr>
+        <w:spacing w:line="240" w:lineRule="auto"/>
+        <w:jc w:val="both"/>
+        <w:rPr>
+          <w:rFonts w:ascii="Times New Roman" w:hAnsi="Times New Roman" w:cs="Times New Roman"/>
+          <w:b/>
+        </w:rPr>
+      </w:pPr>
+      <w:proofErr w:type="spellStart"/>
+      <w:r>
+        <w:rPr>
+          <w:rFonts w:ascii="Times New Roman" w:hAnsi="Times New Roman" w:cs="Times New Roman"/>
+          <w:b/>
+        </w:rPr>
+        <w:t>Commit</w:t>
+      </w:r>
+      <w:proofErr w:type="spellEnd"/>
+      <w:r>
+        <w:rPr>
+          <w:rFonts w:ascii="Times New Roman" w:hAnsi="Times New Roman" w:cs="Times New Roman"/>
+          <w:b/>
+        </w:rPr>
+        <w:t xml:space="preserve"> 2</w:t>
+      </w:r>
+    </w:p>
+    <w:p>
+      <w:pPr>
+        <w:spacing w:line="240" w:lineRule="auto"/>
+        <w:jc w:val="both"/>
+        <w:rPr>
+          <w:rFonts w:ascii="Times New Roman" w:hAnsi="Times New Roman" w:cs="Times New Roman"/>
+          <w:b/>
+        </w:rPr>
+      </w:pPr>
+      <w:r>
+        <w:rPr>
+          <w:rFonts w:ascii="Times New Roman" w:hAnsi="Times New Roman" w:cs="Times New Roman"/>
+          <w:b/>
+        </w:rPr>
+        <w:lastRenderedPageBreak/>
+        <w:drawing>
+          <wp:inline distT="0" distB="0" distL="0" distR="0" wp14:anchorId="10C4A763" wp14:editId="4203B115">
+            <wp:extent cx="5612130" cy="3833495"/>
+            <wp:effectExtent l="0" t="0" r="7620" b="0"/>
+            <wp:docPr id="6" name="Imagen 6"/>
+            <wp:cNvGraphicFramePr>
+              <a:graphicFrameLocks xmlns:a="http://schemas.openxmlformats.org/drawingml/2006/main" noChangeAspect="1"/>
+            </wp:cNvGraphicFramePr>
+            <a:graphic xmlns:a="http://schemas.openxmlformats.org/drawingml/2006/main">
+              <a:graphicData uri="http://schemas.openxmlformats.org/drawingml/2006/picture">
+                <pic:pic xmlns:pic="http://schemas.openxmlformats.org/drawingml/2006/picture">
+                  <pic:nvPicPr>
+                    <pic:cNvPr id="1" name=""/>
+                    <pic:cNvPicPr/>
+                  </pic:nvPicPr>
+                  <pic:blipFill>
+                    <a:blip r:embed="rId10"/>
+                    <a:stretch>
+                      <a:fillRect/>
+                    </a:stretch>
+                  </pic:blipFill>
+                  <pic:spPr>
+                    <a:xfrm>
+                      <a:off x="0" y="0"/>
+                      <a:ext cx="5612130" cy="3833495"/>
+                    </a:xfrm>
+                    <a:prstGeom prst="rect">
+                      <a:avLst/>
+                    </a:prstGeom>
+                  </pic:spPr>
+                </pic:pic>
+              </a:graphicData>
+            </a:graphic>
+          </wp:inline>
+        </w:drawing>
+      </w:r>
+    </w:p>
+    <w:p>
+      <w:pPr>
+        <w:spacing w:line="240" w:lineRule="auto"/>
+        <w:jc w:val="both"/>
+        <w:rPr>
+          <w:rFonts w:ascii="Times New Roman" w:hAnsi="Times New Roman" w:cs="Times New Roman"/>
+          <w:b/>
+        </w:rPr>
+      </w:pPr>
+    </w:p>
+    <w:p>
+      <w:pPr>
+        <w:spacing w:line="240" w:lineRule="auto"/>
+        <w:jc w:val="both"/>
+        <w:rPr>
+          <w:rFonts w:ascii="Times New Roman" w:hAnsi="Times New Roman" w:cs="Times New Roman"/>
+          <w:b/>
+        </w:rPr>
+      </w:pPr>
+      <w:proofErr w:type="spellStart"/>
+      <w:r>
+        <w:rPr>
+          <w:rFonts w:ascii="Times New Roman" w:hAnsi="Times New Roman" w:cs="Times New Roman"/>
+          <w:b/>
+        </w:rPr>
+        <w:t>Commit</w:t>
+      </w:r>
+      <w:proofErr w:type="spellEnd"/>
+      <w:r>
+        <w:rPr>
+          <w:rFonts w:ascii="Times New Roman" w:hAnsi="Times New Roman" w:cs="Times New Roman"/>
+          <w:b/>
+        </w:rPr>
+        <w:t xml:space="preserve"> 3</w:t>
+      </w:r>
+    </w:p>
+    <w:p>
+      <w:pPr>
+        <w:spacing w:line="240" w:lineRule="auto"/>
+        <w:jc w:val="both"/>
+        <w:rPr>
+          <w:rFonts w:ascii="Times New Roman" w:hAnsi="Times New Roman" w:cs="Times New Roman"/>
+          <w:b/>
+        </w:rPr>
+      </w:pPr>
+      <w:r>
+        <w:rPr>
+          <w:rFonts w:ascii="Times New Roman" w:hAnsi="Times New Roman" w:cs="Times New Roman"/>
+          <w:b/>
+        </w:rPr>
+        <w:lastRenderedPageBreak/>
+        <w:drawing>
+          <wp:inline distT="0" distB="0" distL="0" distR="0" wp14:anchorId="256D2652" wp14:editId="109B4B1A">
+            <wp:extent cx="5612130" cy="4511040"/>
+            <wp:effectExtent l="0" t="0" r="7620" b="3810"/>
+            <wp:docPr id="7" name="Imagen 7"/>
+            <wp:cNvGraphicFramePr>
+              <a:graphicFrameLocks xmlns:a="http://schemas.openxmlformats.org/drawingml/2006/main" noChangeAspect="1"/>
+            </wp:cNvGraphicFramePr>
+            <a:graphic xmlns:a="http://schemas.openxmlformats.org/drawingml/2006/main">
+              <a:graphicData uri="http://schemas.openxmlformats.org/drawingml/2006/picture">
+                <pic:pic xmlns:pic="http://schemas.openxmlformats.org/drawingml/2006/picture">
+                  <pic:nvPicPr>
+                    <pic:cNvPr id="1" name=""/>
+                    <pic:cNvPicPr/>
+                  </pic:nvPicPr>
+                  <pic:blipFill>
+                    <a:blip r:embed="rId11"/>
+                    <a:stretch>
+                      <a:fillRect/>
+                    </a:stretch>
+                  </pic:blipFill>
+                  <pic:spPr>
+                    <a:xfrm>
+                      <a:off x="0" y="0"/>
+                      <a:ext cx="5612130" cy="4511040"/>
                     </a:xfrm>
                     <a:prstGeom prst="rect">
                       <a:avLst/>

</xml_diff>